<commit_message>
Mandat : rétractation, médiateur, clauses apparentes et mentions de l'agence obligatoires (#99)
Un particulier qui signe hors de l'agence ou à distance reçoit
l'information sur la rétractation de 14 jours et le formulaire type.
Le mandat cite le médiateur de la consommation, l'assurance RCP, l'ORIAS
avec l'assureur loyers impayés (plus de contrat SADA écrit en dur), met
l'exclusivité et l'indemnité en gras avec le rappel de l'article 78, et
précise le lieu et l'exemplaire remis. Une mention manquante sur la fiche
de l'agence, ou le lieu de signature non indiqué, bloque la préparation ;
un modèle déposé sans ces balises est refusé.

Co-Authored-By: Claude Opus 5.5 (1M context) <noreply@anthropic.com>
Claude-Session: https://claude.ai/code/session_01MGsp1mkkxaGKJEgcTqas9m
</commit_message>
<xml_diff>
--- a/documents/modeles/mandat_gestion.docx
+++ b/documents/modeles/mandat_gestion.docx
@@ -422,6 +422,14 @@
         </w:rPr>
         <w:t xml:space="preserve"/>
       </w:r>
+      <w:r>
+        <w:rPr>
+          <w:rFonts w:ascii="Blogger Sans Light" w:hAnsi="Blogger Sans Light"/>
+          <w:sz w:val="24"/>
+          <w:szCs w:val="24"/>
+        </w:rPr>
+        <w:t xml:space="preserve"> Assurance responsabilité civile professionnelle : {{ agence.rcp }}.</w:t>
+      </w:r>
     </w:p>
     <w:p>
       <w:pPr>
@@ -756,11 +764,33 @@
       </w:pPr>
       <w:r>
         <w:rPr>
-          <w:rFonts w:ascii="Blogger Sans Light" w:hAnsi="Blogger Sans Light"/>
-          <w:sz w:val="24"/>
-          <w:szCs w:val="24"/>
-        </w:rPr>
-        <w:t>En cas de résiliation en cours de période, le mandataire aura droit à une indemnité fixée au montant des honoraires restant à courir.</w:t>
+          <w:b/>
+          <w:bCs/>
+          <w:rFonts w:ascii="Blogger Sans Light" w:hAnsi="Blogger Sans Light"/>
+          <w:sz w:val="24"/>
+          <w:szCs w:val="24"/>
+        </w:rPr>
+        <w:t xml:space="preserve">En cas de résiliation en cours de période, le mandataire aura droit à une indemnité fixée au montant des honoraires restant à courir.</w:t>
+      </w:r>
+    </w:p>
+    <w:p>
+      <w:pPr>
+        <w:jc w:val="both"/>
+        <w:rPr>
+          <w:rFonts w:ascii="Blogger Sans Light" w:hAnsi="Blogger Sans Light"/>
+          <w:sz w:val="24"/>
+          <w:szCs w:val="24"/>
+        </w:rPr>
+      </w:pPr>
+      <w:r>
+        <w:rPr>
+          <w:b/>
+          <w:bCs/>
+          <w:rFonts w:ascii="Blogger Sans Light" w:hAnsi="Blogger Sans Light"/>
+          <w:sz w:val="24"/>
+          <w:szCs w:val="24"/>
+        </w:rPr>
+        <w:t xml:space="preserve">Le présent mandat comporte une clause d'exclusivité et une clause pénale. Passé un délai de trois mois à compter de sa signature, il peut être dénoncé à tout moment par chacune des parties, à charge pour celle qui entend y mettre fin d'en aviser l'autre partie quinze jours au moins à l'avance par lettre recommandée avec demande d'avis de réception (article 78 du décret n° 72-678 du 20 juillet 1972).</w:t>
       </w:r>
     </w:p>
     <w:p>
@@ -1091,6 +1121,8 @@
       </w:r>
       <w:r>
         <w:rPr>
+          <w:b/>
+          <w:bCs/>
           <w:rFonts w:ascii="Blogger Sans Light" w:hAnsi="Blogger Sans Light"/>
           <w:sz w:val="24"/>
           <w:szCs w:val="24"/>
@@ -1349,7 +1381,7 @@
           <w:sz w:val="24"/>
           <w:szCs w:val="24"/>
         </w:rPr>
-        <w:t>Contrat souscrit auprès de SADA Assurances numéro 1P0012207</w:t>
+        <w:t xml:space="preserve">Contrat souscrit auprès de {{ agence.assurance_gli }}, numéro {{ agence.assurance_gli_contrat }}, par l'intermédiaire du mandataire, immatriculé à l'ORIAS sous le numéro {{ agence.orias }} (www.orias.fr).</w:t>
       </w:r>
     </w:p>
     <w:p>
@@ -1865,7 +1897,7 @@
           <w:sz w:val="24"/>
           <w:szCs w:val="24"/>
         </w:rPr>
-        <w:t>Les honoraires du mandataire pour effectuer la visite du (futur) locataire, constituer son dossier et rédiger le bail seront partagés par moitié entre le bailleur et le (futur) locataire. Ces honoraires seront dus à la signature du bail du (futur) locataire.</w:t>
+        <w:t>Les honoraires du mandataire pour effectuer la visite du (futur) locataire, constituer son dossier et rédiger le bail seront répartis entre le bailleur et le (futur) locataire. Ces honoraires seront dus à la signature du bail du (futur) locataire.</w:t>
       </w:r>
     </w:p>
     <w:p>
@@ -2066,7 +2098,7 @@
           <w:szCs w:val="24"/>
         </w:rPr>
         <w:tab/>
-        <w:t>Les honoraires du mandataire pour la réalisation de l’état des lieux d’entrée seront partagés par moitié entre le bailleur et le (futur) locataire. Ces honoraires seront dus à la suite de la réalisation dudit état des lieux d’entrée.</w:t>
+        <w:t>Les honoraires du mandataire pour la réalisation de l’état des lieux d’entrée seront répartis entre le bailleur et le (futur) locataire. Ces honoraires seront dus à la suite de la réalisation dudit état des lieux d’entrée.</w:t>
       </w:r>
     </w:p>
     <w:p>
@@ -2578,7 +2610,7 @@
           <w:sz w:val="24"/>
           <w:szCs w:val="24"/>
         </w:rPr>
-        <w:t xml:space="preserve">Les parties signataires autorisent expressément le mandataire à saisir l’ensemble des informations, objets du présent acte, sur fichier informatique. Conformément à la loi du 6 janvier 1978, le mandant dispose d’un droit d’accès et de rectification, à formuler auprès du mandataire. </w:t>
+        <w:t xml:space="preserve">Les informations du présent mandat sont traitées par le mandataire pour son exécution et pour le respect de ses obligations légales (comptabilité, lutte contre le blanchiment). Elles sont conservées pendant la durée du mandat, puis pendant les durées de prescription et de conservation légales. Le mandant dispose d'un droit d'accès, de rectification, d'effacement, de limitation et d'opposition dans les conditions prévues par le règlement (UE) 2016/679, en écrivant au mandataire, et peut introduire une réclamation auprès de la CNIL (www.cnil.fr).</w:t>
       </w:r>
     </w:p>
     <w:p>
@@ -2612,6 +2644,162 @@
           <w:sz w:val="24"/>
           <w:szCs w:val="24"/>
         </w:rPr>
+        <w:t xml:space="preserve">Médiation de la consommation</w:t>
+      </w:r>
+    </w:p>
+    <w:p>
+      <w:pPr>
+        <w:jc w:val="both"/>
+        <w:rPr>
+          <w:rFonts w:ascii="Blogger Sans Light" w:hAnsi="Blogger Sans Light"/>
+          <w:sz w:val="24"/>
+          <w:szCs w:val="24"/>
+        </w:rPr>
+      </w:pPr>
+      <w:r>
+        <w:rPr>
+          <w:rFonts w:ascii="Blogger Sans Light" w:hAnsi="Blogger Sans Light"/>
+          <w:sz w:val="24"/>
+          <w:szCs w:val="24"/>
+        </w:rPr>
+        <w:t xml:space="preserve">En cas de litige, après une réclamation écrite restée sans réponse satisfaisante, le mandant consommateur peut recourir gratuitement au médiateur de la consommation : {{ agence.mediateur }}, {{ agence.mediateur_site }}.</w:t>
+      </w:r>
+    </w:p>
+    <w:p>
+      <w:pPr>
+        <w:jc w:val="both"/>
+        <w:rPr>
+          <w:rFonts w:ascii="Blogger Sans Light" w:hAnsi="Blogger Sans Light"/>
+          <w:sz w:val="24"/>
+          <w:szCs w:val="24"/>
+        </w:rPr>
+      </w:pPr>
+      <w:r>
+        <w:rPr>
+          <w:rFonts w:ascii="Blogger Sans Light" w:hAnsi="Blogger Sans Light"/>
+          <w:sz w:val="24"/>
+          <w:szCs w:val="24"/>
+        </w:rPr>
+        <w:t xml:space="preserve">{%p if retractation %}</w:t>
+      </w:r>
+    </w:p>
+    <w:p>
+      <w:pPr>
+        <w:jc w:val="both"/>
+        <w:rPr>
+          <w:rFonts w:ascii="Blogger Sans Light" w:hAnsi="Blogger Sans Light"/>
+          <w:b/>
+          <w:bCs/>
+          <w:color w:val="7F7F7F" w:themeColor="text1" w:themeTint="80"/>
+          <w:sz w:val="24"/>
+          <w:szCs w:val="24"/>
+        </w:rPr>
+      </w:pPr>
+      <w:r>
+        <w:rPr>
+          <w:rFonts w:ascii="Blogger Sans Light" w:hAnsi="Blogger Sans Light"/>
+          <w:b/>
+          <w:bCs/>
+          <w:color w:val="7F7F7F" w:themeColor="text1" w:themeTint="80"/>
+          <w:sz w:val="24"/>
+          <w:szCs w:val="24"/>
+        </w:rPr>
+        <w:t xml:space="preserve">Droit de rétractation</w:t>
+      </w:r>
+    </w:p>
+    <w:p>
+      <w:pPr>
+        <w:jc w:val="both"/>
+        <w:rPr>
+          <w:rFonts w:ascii="Blogger Sans Light" w:hAnsi="Blogger Sans Light"/>
+          <w:sz w:val="24"/>
+          <w:szCs w:val="24"/>
+        </w:rPr>
+      </w:pPr>
+      <w:r>
+        <w:rPr>
+          <w:rFonts w:ascii="Blogger Sans Light" w:hAnsi="Blogger Sans Light"/>
+          <w:sz w:val="24"/>
+          <w:szCs w:val="24"/>
+        </w:rPr>
+        <w:t xml:space="preserve">{%p for ligne in retractation %}</w:t>
+      </w:r>
+    </w:p>
+    <w:p>
+      <w:pPr>
+        <w:jc w:val="both"/>
+        <w:rPr>
+          <w:rFonts w:ascii="Blogger Sans Light" w:hAnsi="Blogger Sans Light"/>
+          <w:sz w:val="24"/>
+          <w:szCs w:val="24"/>
+        </w:rPr>
+      </w:pPr>
+      <w:r>
+        <w:rPr>
+          <w:rFonts w:ascii="Blogger Sans Light" w:hAnsi="Blogger Sans Light"/>
+          <w:sz w:val="24"/>
+          <w:szCs w:val="24"/>
+        </w:rPr>
+        <w:t xml:space="preserve">{{ ligne }}</w:t>
+      </w:r>
+    </w:p>
+    <w:p>
+      <w:pPr>
+        <w:jc w:val="both"/>
+        <w:rPr>
+          <w:rFonts w:ascii="Blogger Sans Light" w:hAnsi="Blogger Sans Light"/>
+          <w:sz w:val="24"/>
+          <w:szCs w:val="24"/>
+        </w:rPr>
+      </w:pPr>
+      <w:r>
+        <w:rPr>
+          <w:rFonts w:ascii="Blogger Sans Light" w:hAnsi="Blogger Sans Light"/>
+          <w:sz w:val="24"/>
+          <w:szCs w:val="24"/>
+        </w:rPr>
+        <w:t xml:space="preserve">{%p endfor %}</w:t>
+      </w:r>
+    </w:p>
+    <w:p>
+      <w:pPr>
+        <w:jc w:val="both"/>
+        <w:rPr>
+          <w:rFonts w:ascii="Blogger Sans Light" w:hAnsi="Blogger Sans Light"/>
+          <w:sz w:val="24"/>
+          <w:szCs w:val="24"/>
+        </w:rPr>
+      </w:pPr>
+      <w:r>
+        <w:rPr>
+          <w:rFonts w:ascii="Blogger Sans Light" w:hAnsi="Blogger Sans Light"/>
+          <w:sz w:val="24"/>
+          <w:szCs w:val="24"/>
+        </w:rPr>
+        <w:t xml:space="preserve">{%p endif %}</w:t>
+      </w:r>
+    </w:p>
+    <w:p>
+      <w:pPr>
+        <w:jc w:val="both"/>
+        <w:rPr>
+          <w:rFonts w:ascii="Blogger Sans Light" w:hAnsi="Blogger Sans Light"/>
+          <w:b/>
+          <w:bCs/>
+          <w:color w:val="7F7F7F" w:themeColor="text1" w:themeTint="80"/>
+          <w:sz w:val="24"/>
+          <w:szCs w:val="24"/>
+        </w:rPr>
+      </w:pPr>
+      <w:r>
+        <w:rPr>
+          <w:rFonts w:ascii="Blogger Sans Light" w:hAnsi="Blogger Sans Light"/>
+          <w:b/>
+          <w:bCs/>
+          <w:color w:val="7F7F7F" w:themeColor="text1" w:themeTint="80"/>
+          <w:sz w:val="24"/>
+          <w:szCs w:val="24"/>
+        </w:rPr>
         <w:t>DOCUMENTS A ANNEXER AU PRESENT MANDAT</w:t>
       </w:r>
     </w:p>
@@ -2849,7 +3037,7 @@
           <w:sz w:val="24"/>
           <w:szCs w:val="24"/>
         </w:rPr>
-        <w:t xml:space="preserve">Fait à Toulouse le : </w:t>
+        <w:t xml:space="preserve">Fait à {{ lieu_signature }}, en deux exemplaires originaux dont un remis au mandant, le : </w:t>
       </w:r>
       <w:r>
         <w:rPr>
@@ -3042,6 +3230,101 @@
           <w:szCs w:val="24"/>
         </w:rPr>
         <w:t>é</w:t>
+      </w:r>
+    </w:p>
+    <w:p>
+      <w:pPr>
+        <w:jc w:val="both"/>
+        <w:rPr>
+          <w:rFonts w:ascii="Blogger Sans Light" w:hAnsi="Blogger Sans Light"/>
+          <w:sz w:val="24"/>
+          <w:szCs w:val="24"/>
+        </w:rPr>
+      </w:pPr>
+      <w:r>
+        <w:rPr>
+          <w:rFonts w:ascii="Blogger Sans Light" w:hAnsi="Blogger Sans Light"/>
+          <w:sz w:val="24"/>
+          <w:szCs w:val="24"/>
+        </w:rPr>
+        <w:t xml:space="preserve">{%p if formulaire_retractation %}</w:t>
+      </w:r>
+    </w:p>
+    <w:p>
+      <w:r>
+        <w:br w:type="page"/>
+      </w:r>
+    </w:p>
+    <w:p>
+      <w:pPr>
+        <w:jc w:val="both"/>
+        <w:rPr>
+          <w:rFonts w:ascii="Blogger Sans Light" w:hAnsi="Blogger Sans Light"/>
+          <w:sz w:val="24"/>
+          <w:szCs w:val="24"/>
+        </w:rPr>
+      </w:pPr>
+      <w:r>
+        <w:rPr>
+          <w:rFonts w:ascii="Blogger Sans Light" w:hAnsi="Blogger Sans Light"/>
+          <w:sz w:val="24"/>
+          <w:szCs w:val="24"/>
+        </w:rPr>
+        <w:t xml:space="preserve">{%p for ligne in formulaire_retractation %}</w:t>
+      </w:r>
+    </w:p>
+    <w:p>
+      <w:pPr>
+        <w:jc w:val="both"/>
+        <w:rPr>
+          <w:rFonts w:ascii="Blogger Sans Light" w:hAnsi="Blogger Sans Light"/>
+          <w:sz w:val="24"/>
+          <w:szCs w:val="24"/>
+        </w:rPr>
+      </w:pPr>
+      <w:r>
+        <w:rPr>
+          <w:rFonts w:ascii="Blogger Sans Light" w:hAnsi="Blogger Sans Light"/>
+          <w:sz w:val="24"/>
+          <w:szCs w:val="24"/>
+        </w:rPr>
+        <w:t xml:space="preserve">{{ ligne }}</w:t>
+      </w:r>
+    </w:p>
+    <w:p>
+      <w:pPr>
+        <w:jc w:val="both"/>
+        <w:rPr>
+          <w:rFonts w:ascii="Blogger Sans Light" w:hAnsi="Blogger Sans Light"/>
+          <w:sz w:val="24"/>
+          <w:szCs w:val="24"/>
+        </w:rPr>
+      </w:pPr>
+      <w:r>
+        <w:rPr>
+          <w:rFonts w:ascii="Blogger Sans Light" w:hAnsi="Blogger Sans Light"/>
+          <w:sz w:val="24"/>
+          <w:szCs w:val="24"/>
+        </w:rPr>
+        <w:t xml:space="preserve">{%p endfor %}</w:t>
+      </w:r>
+    </w:p>
+    <w:p>
+      <w:pPr>
+        <w:jc w:val="both"/>
+        <w:rPr>
+          <w:rFonts w:ascii="Blogger Sans Light" w:hAnsi="Blogger Sans Light"/>
+          <w:sz w:val="24"/>
+          <w:szCs w:val="24"/>
+        </w:rPr>
+      </w:pPr>
+      <w:r>
+        <w:rPr>
+          <w:rFonts w:ascii="Blogger Sans Light" w:hAnsi="Blogger Sans Light"/>
+          <w:sz w:val="24"/>
+          <w:szCs w:val="24"/>
+        </w:rPr>
+        <w:t xml:space="preserve">{%p endif %}</w:t>
       </w:r>
     </w:p>
     <w:p>

</xml_diff>